<commit_message>
docs: update Lawyer specification audit
</commit_message>
<xml_diff>
--- a/docs/Отчёт-по-соответствию-ТЗ-Lawyer.docx
+++ b/docs/Отчёт-по-соответствию-ТЗ-Lawyer.docx
@@ -256,7 +256,7 @@
                 <w:color w:val="1F2937"/>
                 <w:sz w:val="18"/>
               </w:rPr>
-              <w:t>3 сентября 2026 года</w:t>
+              <w:t>5 сентября 2026 года</w:t>
             </w:r>
           </w:p>
         </w:tc>
@@ -390,7 +390,7 @@
                 <w:color w:val="1F2937"/>
                 <w:sz w:val="19"/>
               </w:rPr>
-              <w:t>Система развёрнута и имеет рабочую базу для двух Bitrix24, трёх юрлиц, 1С, Яндекса, SLA, расходов и ROMI. Однако полное соответствие ТЗ пока не достигнуто: часть боевых источников не даёт фактов, а ряд аналитических и ролевых функций ещё не реализован.</w:t>
+              <w:t>Функциональные доработки по семи пунктам выполнены: загружаются история стадий и активности, добавлены глобальный фильтр воронки, план-факт, ожидаемые оплаты, средние суммы, цикл сделки, аналитика отделов, роли и комментарии по сделкам. До приёмки остаётся бизнес-настройка: выбрать 11 воронок, выдать Bitrix24 право user_brief, заполнить сотрудников, отделы и планы, а также завершить параметры трёх аккаунтов Яндекса и проверить факты 1С.</w:t>
             </w:r>
           </w:p>
         </w:tc>
@@ -622,7 +622,7 @@
                 <w:color w:val="1F2937"/>
                 <w:sz w:val="18"/>
               </w:rPr>
-              <w:t>Код готов, но нужны доступы, сопоставления или начальные данны Заказчика.</w:t>
+              <w:t>Код готов, но нужны доступы, сопоставления или начальные данные Заказчика.</w:t>
             </w:r>
           </w:p>
         </w:tc>
@@ -806,7 +806,29 @@
         <w:rPr>
           <w:rFonts w:ascii="Calibri" w:hAnsi="Calibri" w:eastAsia="Calibri"/>
         </w:rPr>
-        <w:t>В базе 354 сделки Bitrix24, но 0 записей истории стадий, 0 поступлений 1С, 0 расходов Директа, 0 визитов Метрики и 0 AI-инсайтов. Это ограничивает полезность части блоков.</w:t>
+        <w:t>В production 779 сделок Bitrix24, 2 360 переходов стадий и 1 999 CRM-активностей. История, звонки и встречи поступают из обоих порталов.</w:t>
+      </w:r>
+    </w:p>
+    <w:p>
+      <w:pPr>
+        <w:pStyle w:val="ListBullet"/>
+      </w:pPr>
+      <w:r>
+        <w:rPr>
+          <w:rFonts w:ascii="Calibri" w:hAnsi="Calibri" w:eastAsia="Calibri"/>
+        </w:rPr>
+        <w:t>Комментарии сформированы для 779 сделок. Базовый комментарий строится из фактов CRM; LLM-версия включается после настройки AI-интеграции.</w:t>
+      </w:r>
+    </w:p>
+    <w:p>
+      <w:pPr>
+        <w:pStyle w:val="ListBullet"/>
+      </w:pPr>
+      <w:r>
+        <w:rPr>
+          <w:rFonts w:ascii="Calibri" w:hAnsi="Calibri" w:eastAsia="Calibri"/>
+        </w:rPr>
+        <w:t>Поступлений 1С, расходов Директа, визитов Метрики и ручных расходов пока нет. Финансовые и ROMI-блоки корректно остаются без расчётных значений до появления фактов.</w:t>
       </w:r>
     </w:p>
     <w:p>
@@ -828,7 +850,7 @@
         <w:rPr>
           <w:rFonts w:ascii="Calibri" w:hAnsi="Calibri" w:eastAsia="Calibri"/>
         </w:rPr>
-        <w:t>Отделы, сотрудники и планы в production не заполнены; список менеджеров зависит от прав Bitrix24 на метод user.get.</w:t>
+        <w:t>Отделы, сотрудники, планы и отдельные пользователи панели в production не заполнены. Вход выполняется резервной учётной записью собственника.</w:t>
       </w:r>
     </w:p>
     <w:p>
@@ -839,7 +861,18 @@
         <w:rPr>
           <w:rFonts w:ascii="Calibri" w:hAnsi="Calibri" w:eastAsia="Calibri"/>
         </w:rPr>
-        <w:t>Ручные расходы и возвращённый ROMI внесены в production; миграция 0009 применена, 114 backend-тестов прошли.</w:t>
+        <w:t>Оба webhook Bitrix24 читают CRM, но отклоняют user.get из-за недостаточных прав; поэтому часть ответственных пока отображается по ID.</w:t>
+      </w:r>
+    </w:p>
+    <w:p>
+      <w:pPr>
+        <w:pStyle w:val="ListBullet"/>
+      </w:pPr>
+      <w:r>
+        <w:rPr>
+          <w:rFonts w:ascii="Calibri" w:hAnsi="Calibri" w:eastAsia="Calibri"/>
+        </w:rPr>
+        <w:t>Исходный код опубликован в GitHub main, актуальный коммит 4f13e8d. Последнее исправление прошло lint и 42 целевых теста.</w:t>
       </w:r>
     </w:p>
     <w:p>
@@ -1206,7 +1239,7 @@
               <w:insideV w:val="single" w:sz="4" w:color="D0D5DD"/>
             </w:tcBorders>
             <w:vAlign w:val="top"/>
-            <w:shd w:fill="FFF4CC"/>
+            <w:shd w:fill="E7F6EC"/>
           </w:tcPr>
           <w:p>
             <w:pPr>
@@ -1219,7 +1252,7 @@
                 <w:color w:val="1F2937"/>
                 <w:sz w:val="16"/>
               </w:rPr>
-              <w:t>Частично</w:t>
+              <w:t>Реализовано</w:t>
             </w:r>
           </w:p>
         </w:tc>
@@ -1253,7 +1286,7 @@
                 <w:color w:val="1F2937"/>
                 <w:sz w:val="16"/>
               </w:rPr>
-              <w:t>Интеграции → Bitrix24: два входящих webhook. Сделки загружаются; есть проверка связи и выбор воронок.</w:t>
+              <w:t>Два входящих webhook. Сделки, история стадий, звонки и встречи загружаются раздельно по источникам box/cloud. В production: 779 сделок, 2 360 переходов и 1 999 активностей.</w:t>
             </w:r>
           </w:p>
         </w:tc>
@@ -1287,7 +1320,7 @@
                 <w:color w:val="1F2937"/>
                 <w:sz w:val="16"/>
               </w:rPr>
-              <w:t>Выгрузка истории стадий и активностей не включена в конвейер.</w:t>
+              <w:t>Добавить право user_brief для загрузки ФИО.</w:t>
             </w:r>
           </w:p>
         </w:tc>
@@ -1395,7 +1428,7 @@
                 <w:color w:val="1F2937"/>
                 <w:sz w:val="16"/>
               </w:rPr>
-              <w:t>Настройки → Структура и планы: сопоставление ID пользователя, источника CRM, ФИО, юрлица и отдела.</w:t>
+              <w:t>Автоматический справочник user.get и ручное сопоставление ID → ФИО реализованы. Ручное сохранение сразу обновляет ранее загруженные сделки.</w:t>
             </w:r>
           </w:p>
         </w:tc>
@@ -1429,7 +1462,7 @@
                 <w:color w:val="1F2937"/>
                 <w:sz w:val="16"/>
               </w:rPr>
-              <w:t>Дать webhook право user_brief/user.get или заполнить сопоставления вручную.</w:t>
+              <w:t>В обоих webhook включить scope user_brief либо заполнить Настройки → Сотрудники вручную.</w:t>
             </w:r>
           </w:p>
         </w:tc>
@@ -1537,7 +1570,7 @@
                 <w:color w:val="1F2937"/>
                 <w:sz w:val="16"/>
               </w:rPr>
-              <w:t>Адаптер боевого endpoint, Basic Authentication, скользящее окно, дедупликация и журнал сопоставлений реализованы.</w:t>
+              <w:t>Адаптер боевого endpoint, HTTP POST, Basic Authentication, скользящее окно, дедупликация и журнал сопоставлений реализованы.</w:t>
             </w:r>
           </w:p>
         </w:tc>
@@ -1571,7 +1604,7 @@
                 <w:color w:val="1F2937"/>
                 <w:sz w:val="16"/>
               </w:rPr>
-              <w:t>В production 0 поступлений: проверить учётные данны, сеть и ручной запуск ingest.</w:t>
+              <w:t>В production 0 поступлений: проверить доступность endpoint и учётные данные, затем запустить пересчёт.</w:t>
             </w:r>
           </w:p>
         </w:tc>
@@ -1963,7 +1996,7 @@
                 <w:color w:val="1F2937"/>
                 <w:sz w:val="16"/>
               </w:rPr>
-              <w:t>Интеграции → Яндекс: отдельные поля на ЮО, ЦСВ, УрПАСЭ; адаптеры Direct Reports API и Metrika API.</w:t>
+              <w:t>Интеграции → Яндекс: отдельные комплекты настроек для ЮО, ЦСВ и УрПАСЭ; адаптеры Direct Reports API и Metrika API.</w:t>
             </w:r>
           </w:p>
         </w:tc>
@@ -1997,7 +2030,7 @@
                 <w:color w:val="1F2937"/>
                 <w:sz w:val="16"/>
               </w:rPr>
-              <w:t>Токены есть, но нужны логины Direct и ID счётчиков; в базе пока 0 расходов/0 визитов.</w:t>
+              <w:t>OAuth-токены сохранены. Для каждого юрлица заполнить логин Директа и ID счётчика Метрики; в базе пока 0 расходов и 0 визитов.</w:t>
             </w:r>
           </w:p>
         </w:tc>
@@ -2372,7 +2405,7 @@
               <w:insideV w:val="single" w:sz="4" w:color="D0D5DD"/>
             </w:tcBorders>
             <w:vAlign w:val="top"/>
-            <w:shd w:fill="FFF4CC"/>
+            <w:shd w:fill="E7F6EC"/>
           </w:tcPr>
           <w:p>
             <w:pPr>
@@ -2385,7 +2418,7 @@
                 <w:color w:val="1F2937"/>
                 <w:sz w:val="16"/>
               </w:rPr>
-              <w:t>Частично</w:t>
+              <w:t>Реализовано</w:t>
             </w:r>
           </w:p>
         </w:tc>
@@ -2419,7 +2452,7 @@
                 <w:color w:val="1F2937"/>
                 <w:sz w:val="16"/>
               </w:rPr>
-              <w:t>На дашборде есть «Воронка обработки» с конверсиями и периодом.</w:t>
+              <w:t>Воронка обработки использует фактическую историю стадий. Глобальный фильтр воронки применяется к KPI, таблицам и аналитическим блокам.</w:t>
             </w:r>
           </w:p>
         </w:tc>
@@ -2453,7 +2486,7 @@
                 <w:color w:val="1F2937"/>
                 <w:sz w:val="16"/>
               </w:rPr>
-              <w:t>Нет глобального фильтра воронки; расчёт не опирается на фактическую историю стадий.</w:t>
+              <w:t>Провести бизнес-приёмку после выбора окончательных 11 воронок.</w:t>
             </w:r>
           </w:p>
         </w:tc>
@@ -2527,7 +2560,7 @@
                 <w:color w:val="1F2937"/>
                 <w:sz w:val="16"/>
               </w:rPr>
-              <w:t>Частично</w:t>
+              <w:t>Требует настройки</w:t>
             </w:r>
           </w:p>
         </w:tc>
@@ -2561,7 +2594,7 @@
                 <w:color w:val="1F2937"/>
                 <w:sz w:val="16"/>
               </w:rPr>
-              <w:t>Настройки → Структура и планы: ввод выручки, оплат и сделок по сотруднику/юрлицу/месяцу.</w:t>
+              <w:t>План-факт реализован для компании, отдела и сотрудника: выручка, оплаты, сделки, звонки и встречи, факт и процент выполнения.</w:t>
             </w:r>
           </w:p>
         </w:tc>
@@ -2595,7 +2628,7 @@
                 <w:color w:val="1F2937"/>
                 <w:sz w:val="16"/>
               </w:rPr>
-              <w:t>Добавить звонки и встречи; план компании/отдела; план-факт и % выполнения. В production планов 0.</w:t>
+              <w:t>В production планов 0. Заполнить структуру и месячные планы.</w:t>
             </w:r>
           </w:p>
         </w:tc>
@@ -2656,7 +2689,7 @@
               <w:insideV w:val="single" w:sz="4" w:color="D0D5DD"/>
             </w:tcBorders>
             <w:vAlign w:val="top"/>
-            <w:shd w:fill="FDECEC"/>
+            <w:shd w:fill="E7F6EC"/>
           </w:tcPr>
           <w:p>
             <w:pPr>
@@ -2669,7 +2702,7 @@
                 <w:color w:val="1F2937"/>
                 <w:sz w:val="16"/>
               </w:rPr>
-              <w:t>Не реализовано</w:t>
+              <w:t>Реализовано</w:t>
             </w:r>
           </w:p>
         </w:tc>
@@ -2703,7 +2736,7 @@
                 <w:color w:val="1F2937"/>
                 <w:sz w:val="16"/>
               </w:rPr>
-              <w:t>В настройках можно указать целевые стадии воронок.</w:t>
+              <w:t>Отдельный расчёт ожидаемых оплат по настроенным стадиям, суммам сделок, периоду, юрлицу и воронке.</w:t>
             </w:r>
           </w:p>
         </w:tc>
@@ -2737,7 +2770,7 @@
                 <w:color w:val="1F2937"/>
                 <w:sz w:val="16"/>
               </w:rPr>
-              <w:t>Нужны формулы ожидания по типам воронок и финальное правило «Заключение Контракта».</w:t>
+              <w:t>Подтвердить целевые стадии, включая «Заключение Контракта».</w:t>
             </w:r>
           </w:p>
         </w:tc>
@@ -2798,7 +2831,7 @@
               <w:insideV w:val="single" w:sz="4" w:color="D0D5DD"/>
             </w:tcBorders>
             <w:vAlign w:val="top"/>
-            <w:shd w:fill="FDECEC"/>
+            <w:shd w:fill="E7F6EC"/>
           </w:tcPr>
           <w:p>
             <w:pPr>
@@ -2811,7 +2844,7 @@
                 <w:color w:val="1F2937"/>
                 <w:sz w:val="16"/>
               </w:rPr>
-              <w:t>Не реализовано</w:t>
+              <w:t>Реализовано</w:t>
             </w:r>
           </w:p>
         </w:tc>
@@ -2845,7 +2878,7 @@
                 <w:color w:val="1F2937"/>
                 <w:sz w:val="16"/>
               </w:rPr>
-              <w:t>Базовые суммы Bitrix24 и 1С хранятся раздельно.</w:t>
+              <w:t>На дашборде рассчитаны средняя сумма договора по CRM и средняя сумма поступления по фактам 1С.</w:t>
             </w:r>
           </w:p>
         </w:tc>
@@ -2879,7 +2912,7 @@
                 <w:color w:val="1F2937"/>
                 <w:sz w:val="16"/>
               </w:rPr>
-              <w:t>Добавить KPI «Средняя сумма договора» и «Средняя сумма поступления».</w:t>
+              <w:t>Средняя сумма поступления появится после загрузки 1С.</w:t>
             </w:r>
           </w:p>
         </w:tc>
@@ -2940,7 +2973,7 @@
               <w:insideV w:val="single" w:sz="4" w:color="D0D5DD"/>
             </w:tcBorders>
             <w:vAlign w:val="top"/>
-            <w:shd w:fill="FDECEC"/>
+            <w:shd w:fill="E7F6EC"/>
           </w:tcPr>
           <w:p>
             <w:pPr>
@@ -2953,7 +2986,7 @@
                 <w:color w:val="1F2937"/>
                 <w:sz w:val="16"/>
               </w:rPr>
-              <w:t>Не реализовано</w:t>
+              <w:t>Реализовано</w:t>
             </w:r>
           </w:p>
         </w:tc>
@@ -2987,7 +3020,7 @@
                 <w:color w:val="1F2937"/>
                 <w:sz w:val="16"/>
               </w:rPr>
-              <w:t>Даты создания/закрытия частично доступны в сырье.</w:t>
+              <w:t>Средний цикл рассчитывается по фактическим переходам и датам сделок с учётом глобальных фильтров.</w:t>
             </w:r>
           </w:p>
         </w:tc>
@@ -3021,7 +3054,7 @@
                 <w:color w:val="1F2937"/>
                 <w:sz w:val="16"/>
               </w:rPr>
-              <w:t>Нужны метрика, разрезы и визуализация.</w:t>
+              <w:t>Проверить трактовку финальной стадии на выбранных воронках.</w:t>
             </w:r>
           </w:p>
         </w:tc>
@@ -3082,7 +3115,7 @@
               <w:insideV w:val="single" w:sz="4" w:color="D0D5DD"/>
             </w:tcBorders>
             <w:vAlign w:val="top"/>
-            <w:shd w:fill="FFF4CC"/>
+            <w:shd w:fill="E7F6EC"/>
           </w:tcPr>
           <w:p>
             <w:pPr>
@@ -3095,7 +3128,7 @@
                 <w:color w:val="1F2937"/>
                 <w:sz w:val="16"/>
               </w:rPr>
-              <w:t>Частично</w:t>
+              <w:t>Реализовано</w:t>
             </w:r>
           </w:p>
         </w:tc>
@@ -3129,7 +3162,7 @@
                 <w:color w:val="1F2937"/>
                 <w:sz w:val="16"/>
               </w:rPr>
-              <w:t>Дашборд → «Контроль менеджеров»: в работе, просрочки, без задачи, счета, оплаты, сумма, зона.</w:t>
+              <w:t>Контроль менеджеров дополнен конверсией и план-фактом продаж, звонков и встреч.</w:t>
             </w:r>
           </w:p>
         </w:tc>
@@ -3163,7 +3196,7 @@
                 <w:color w:val="1F2937"/>
                 <w:sz w:val="16"/>
               </w:rPr>
-              <w:t>Добавить личную конверсию, план/факт продаж, звонков, встреч.</w:t>
+              <w:t>Настроить ФИО и соответствие сотрудников, затем внести планы.</w:t>
             </w:r>
           </w:p>
         </w:tc>
@@ -3224,7 +3257,7 @@
               <w:insideV w:val="single" w:sz="4" w:color="D0D5DD"/>
             </w:tcBorders>
             <w:vAlign w:val="top"/>
-            <w:shd w:fill="FDECEC"/>
+            <w:shd w:fill="FFF4CC"/>
           </w:tcPr>
           <w:p>
             <w:pPr>
@@ -3237,7 +3270,7 @@
                 <w:color w:val="1F2937"/>
                 <w:sz w:val="16"/>
               </w:rPr>
-              <w:t>Не реализовано</w:t>
+              <w:t>Требует настройки</w:t>
             </w:r>
           </w:p>
         </w:tc>
@@ -3271,7 +3304,7 @@
                 <w:color w:val="1F2937"/>
                 <w:sz w:val="16"/>
               </w:rPr>
-              <w:t>Справочники отделов и привязки сотрудников есть в настройках.</w:t>
+              <w:t>Добавлен отдельный блок отделов: сотрудники, лиды, сделки в работе, конверсия, звонки, встречи, оплаты и выручка.</w:t>
             </w:r>
           </w:p>
         </w:tc>
@@ -3305,7 +3338,7 @@
                 <w:color w:val="1F2937"/>
                 <w:sz w:val="16"/>
               </w:rPr>
-              <w:t>Нужен отдельный расчёт/блок: лиды, сделки в работе, конверсии, звонки.</w:t>
+              <w:t>В production отделов 0; создать отделы и привязать сотрудников.</w:t>
             </w:r>
           </w:p>
         </w:tc>
@@ -3538,7 +3571,7 @@
               <w:insideV w:val="single" w:sz="4" w:color="D0D5DD"/>
             </w:tcBorders>
             <w:vAlign w:val="top"/>
-            <w:shd w:fill="FFF4CC"/>
+            <w:shd w:fill="E7F6EC"/>
           </w:tcPr>
           <w:p>
             <w:pPr>
@@ -3551,7 +3584,7 @@
                 <w:color w:val="1F2937"/>
                 <w:sz w:val="16"/>
               </w:rPr>
-              <w:t>Частично</w:t>
+              <w:t>Реализовано</w:t>
             </w:r>
           </w:p>
         </w:tc>
@@ -3585,7 +3618,7 @@
                 <w:color w:val="1F2937"/>
                 <w:sz w:val="16"/>
               </w:rPr>
-              <w:t>Мониторинг и настраиваемые пороги реализованы; SLA вынесен в настройки с историей/откатом.</w:t>
+              <w:t>Мониторинг использует фактическое время входа в стадию из stage_history; пороги SLA вынесены в настройки с историей и откатом.</w:t>
             </w:r>
           </w:p>
         </w:tc>
@@ -3619,7 +3652,7 @@
                 <w:color w:val="1F2937"/>
                 <w:sz w:val="16"/>
               </w:rPr>
-              <w:t>Загружать stage_history и фактическое время входа в стадию; сейчас в базе 0 переходов.</w:t>
+              <w:t>Проверить пороги на боевых воронках.</w:t>
             </w:r>
           </w:p>
         </w:tc>
@@ -3680,7 +3713,7 @@
               <w:insideV w:val="single" w:sz="4" w:color="D0D5DD"/>
             </w:tcBorders>
             <w:vAlign w:val="top"/>
-            <w:shd w:fill="FFF4CC"/>
+            <w:shd w:fill="E7F6EC"/>
           </w:tcPr>
           <w:p>
             <w:pPr>
@@ -3693,7 +3726,7 @@
                 <w:color w:val="1F2937"/>
                 <w:sz w:val="16"/>
               </w:rPr>
-              <w:t>Частично</w:t>
+              <w:t>Реализовано</w:t>
             </w:r>
           </w:p>
         </w:tc>
@@ -3727,7 +3760,7 @@
                 <w:color w:val="1F2937"/>
                 <w:sz w:val="16"/>
               </w:rPr>
-              <w:t>Правило и порог 10 дней предусмотрены движком мониторинга.</w:t>
+              <w:t>Правило использует загруженные звонки и встречи, фактическую последнюю активность и настраиваемый порог.</w:t>
             </w:r>
           </w:p>
         </w:tc>
@@ -3761,7 +3794,7 @@
                 <w:color w:val="1F2937"/>
                 <w:sz w:val="16"/>
               </w:rPr>
-              <w:t>Импортировать звонки/встречи и исключения по договорённости с клиентом.</w:t>
+              <w:t>Подтвердить бизнес-исключения по договорённостям с клиентом.</w:t>
             </w:r>
           </w:p>
         </w:tc>
@@ -3964,7 +3997,7 @@
               <w:insideV w:val="single" w:sz="4" w:color="D0D5DD"/>
             </w:tcBorders>
             <w:vAlign w:val="top"/>
-            <w:shd w:fill="FFF4CC"/>
+            <w:shd w:fill="E7F6EC"/>
           </w:tcPr>
           <w:p>
             <w:pPr>
@@ -3977,7 +4010,7 @@
                 <w:color w:val="1F2937"/>
                 <w:sz w:val="16"/>
               </w:rPr>
-              <w:t>Частично</w:t>
+              <w:t>Реализовано</w:t>
             </w:r>
           </w:p>
         </w:tc>
@@ -4011,7 +4044,7 @@
                 <w:color w:val="1F2937"/>
                 <w:sz w:val="16"/>
               </w:rPr>
-              <w:t>Профиль SLA из файла вынесен в Настройки → SLA; пороги, задачи, поля, график, дубли и история изменений есть.</w:t>
+              <w:t>Профиль SLA вынесен в Настройки → SLA; история стадий и активности дают фактические даты первого касания, движения и повторного контакта.</w:t>
             </w:r>
           </w:p>
         </w:tc>
@@ -4045,7 +4078,7 @@
                 <w:color w:val="1F2937"/>
                 <w:sz w:val="16"/>
               </w:rPr>
-              <w:t>Автопроверки 1, 5, 6 не надёжны без первого касания и истории активностей; п. 2/4 требуют формализации.</w:t>
+              <w:t>Пункты, требующие экспертной оценки, принять с руководителями.</w:t>
             </w:r>
           </w:p>
         </w:tc>
@@ -4329,7 +4362,7 @@
                 <w:color w:val="1F2937"/>
                 <w:sz w:val="16"/>
               </w:rPr>
-              <w:t>Нужен ключ LLM и боевые данны; сейчас AI-инсайтов 0.</w:t>
+              <w:t>Нужен ключ LLM и боевые данные; сейчас AI-инсайтов 0.</w:t>
             </w:r>
           </w:p>
         </w:tc>
@@ -4390,7 +4423,7 @@
               <w:insideV w:val="single" w:sz="4" w:color="D0D5DD"/>
             </w:tcBorders>
             <w:vAlign w:val="top"/>
-            <w:shd w:fill="FDECEC"/>
+            <w:shd w:fill="E7F6EC"/>
           </w:tcPr>
           <w:p>
             <w:pPr>
@@ -4403,7 +4436,7 @@
                 <w:color w:val="1F2937"/>
                 <w:sz w:val="16"/>
               </w:rPr>
-              <w:t>Не реализовано</w:t>
+              <w:t>Реализовано</w:t>
             </w:r>
           </w:p>
         </w:tc>
@@ -4437,7 +4470,7 @@
                 <w:color w:val="1F2937"/>
                 <w:sz w:val="16"/>
               </w:rPr>
-              <w:t>Поле для комментария в модели сделки есть.</w:t>
+              <w:t>Комментарий отображается в каждой строке. Есть детерминированная версия по CRM-фактам, fingerprint обновлений и LLM-генерация пакетами.</w:t>
             </w:r>
           </w:p>
         </w:tc>
@@ -4471,7 +4504,7 @@
                 <w:color w:val="1F2937"/>
                 <w:sz w:val="16"/>
               </w:rPr>
-              <w:t>Нужен построчный конвейер, промпт, лимиты/повторы и отображение.</w:t>
+              <w:t>Для LLM-комментариев нужен ключ и модель; сейчас заполнены базовые комментарии для 779 сделок.</w:t>
             </w:r>
           </w:p>
         </w:tc>
@@ -5935,7 +5968,7 @@
               <w:insideV w:val="single" w:sz="4" w:color="D0D5DD"/>
             </w:tcBorders>
             <w:vAlign w:val="top"/>
-            <w:shd w:fill="FDECEC"/>
+            <w:shd w:fill="FFF4CC"/>
           </w:tcPr>
           <w:p>
             <w:pPr>
@@ -5948,7 +5981,7 @@
                 <w:color w:val="1F2937"/>
                 <w:sz w:val="16"/>
               </w:rPr>
-              <w:t>Не реализовано</w:t>
+              <w:t>Требует настройки</w:t>
             </w:r>
           </w:p>
         </w:tc>
@@ -5982,7 +6015,7 @@
                 <w:color w:val="1F2937"/>
                 <w:sz w:val="16"/>
               </w:rPr>
-              <w:t>Сейчас одна учётная запись администратора без RBAC.</w:t>
+              <w:t>RBAC реализован: собственник видит всё, руководитель ограничен отделом, менеджер — своими сделками; финансовые блоки менеджеру скрыты. Есть управление пользователями.</w:t>
             </w:r>
           </w:p>
         </w:tc>
@@ -6016,7 +6049,7 @@
                 <w:color w:val="1F2937"/>
                 <w:sz w:val="16"/>
               </w:rPr>
-              <w:t>Добавить пользователей, роли и скрытие финансов для менеджера.</w:t>
+              <w:t>В production отдельных пользователей 0. Создать учётные записи после заполнения сотрудников и отделов.</w:t>
             </w:r>
           </w:p>
         </w:tc>
@@ -6316,7 +6349,7 @@
         <w:pStyle w:val="Heading1"/>
       </w:pPr>
       <w:r>
-        <w:t>8. Приоритетный план доведения</w:t>
+        <w:t>8. Обязательная настройка перед приёмкой</w:t>
       </w:r>
     </w:p>
     <w:p>
@@ -6324,7 +6357,7 @@
         <w:pStyle w:val="Heading2"/>
       </w:pPr>
       <w:r>
-        <w:t>P0 — данные и бизнес-настройки</w:t>
+        <w:t>Сотрудники и роли</w:t>
       </w:r>
     </w:p>
     <w:p>
@@ -6335,7 +6368,7 @@
         <w:rPr>
           <w:rFonts w:ascii="Calibri" w:hAnsi="Calibri" w:eastAsia="Calibri"/>
         </w:rPr>
-        <w:t>Оставить в панели ровно 11 воронок и привязать каждую к юрлицу и SLA; подтвердить «Заключение Контракта».</w:t>
+        <w:t>В настройках каждого входящего webhook Bitrix24 добавить право на краткий справочник пользователей — scope user_brief. Сейчас оба портала отклоняют user.get, поэтому система видит ID ответственного, но не получает ФИО.</w:t>
       </w:r>
     </w:p>
     <w:p>
@@ -6346,7 +6379,7 @@
         <w:rPr>
           <w:rFonts w:ascii="Calibri" w:hAnsi="Calibri" w:eastAsia="Calibri"/>
         </w:rPr>
-        <w:t>Добавить в webhook Bitrix24 права на чтение пользователей/активностей; заполнить сотрудников и отделы.</w:t>
+        <w:t>После изменения прав открыть «Интеграции», выполнить проверку обоих Bitrix24 и запустить пересчёт. Плановая синхронизация также обновит ФИО во всех ранее загруженных сделках, а не только в новых.</w:t>
       </w:r>
     </w:p>
     <w:p>
@@ -6357,7 +6390,7 @@
         <w:rPr>
           <w:rFonts w:ascii="Calibri" w:hAnsi="Calibri" w:eastAsia="Calibri"/>
         </w:rPr>
-        <w:t>Проверить боевую выгрузку 1С и разобрать журнал исключений/несопоставленных поступлений.</w:t>
+        <w:t>Если право user_brief выдать нельзя, открыть «Настройки → Структура и планы → Сотрудники» и для каждого человека заполнить ФИО, портал box/cloud и ID пользователя Bitrix24. Ручное соответствие применяется к старым сделкам сразу после сохранения.</w:t>
       </w:r>
     </w:p>
     <w:p>
@@ -6368,7 +6401,7 @@
         <w:rPr>
           <w:rFonts w:ascii="Calibri" w:hAnsi="Calibri" w:eastAsia="Calibri"/>
         </w:rPr>
-        <w:t>Заполнить Direct-логины и ID счётчиков для трёх юрлиц; запустить и сверить загрузку.</w:t>
+        <w:t>Создать отделы и привязать к ним сотрудников и юрлица. После этого заполнить месячные планы по компании, отделам и сотрудникам: выручка, оплаты, сделки, звонки и встречи.</w:t>
       </w:r>
     </w:p>
     <w:p>
@@ -6379,7 +6412,7 @@
         <w:rPr>
           <w:rFonts w:ascii="Calibri" w:hAnsi="Calibri" w:eastAsia="Calibri"/>
         </w:rPr>
-        <w:t>Внести начальные планы после доработки модели план-факта.</w:t>
+        <w:t>В управлении пользователями создать учётные записи собственника, руководителей и менеджеров. Для руководителя выбрать отдел, для менеджера — соответствующего сотрудника.</w:t>
       </w:r>
     </w:p>
     <w:p>
@@ -6387,7 +6420,7 @@
         <w:pStyle w:val="Heading2"/>
       </w:pPr>
       <w:r>
-        <w:t>P1 — недостающая логика ТЗ</w:t>
+        <w:t>Три аккаунта Яндекса</w:t>
       </w:r>
     </w:p>
     <w:p>
@@ -6398,7 +6431,7 @@
         <w:rPr>
           <w:rFonts w:ascii="Calibri" w:hAnsi="Calibri" w:eastAsia="Calibri"/>
         </w:rPr>
-        <w:t>Выгружать историю стадий, звонки и встречи; заполнять first_contact_at/stage_entered_at и SLA-факты.</w:t>
+        <w:t>Для ЮО открыть «Интеграции → Яндекс · ЮО». OAuth-токен уже сохранён; заполнить логин клиента Яндекс Директа и числовой ID счётчика Метрики.</w:t>
       </w:r>
     </w:p>
     <w:p>
@@ -6409,7 +6442,7 @@
         <w:rPr>
           <w:rFonts w:ascii="Calibri" w:hAnsi="Calibri" w:eastAsia="Calibri"/>
         </w:rPr>
-        <w:t>Добавить в общую панель фильтр воронки и пересчёт конверсий по истории.</w:t>
+        <w:t>Аналогично заполнить логин Директа и ID счётчика в карточках «Яндекс · ЦСВ» и «Яндекс · УрПАСЭ». OAuth-токены во всех трёх карточках уже присутствуют.</w:t>
       </w:r>
     </w:p>
     <w:p>
@@ -6420,7 +6453,7 @@
         <w:rPr>
           <w:rFonts w:ascii="Calibri" w:hAnsi="Calibri" w:eastAsia="Calibri"/>
         </w:rPr>
-        <w:t>Завершить план-факт компании/отдела/сотрудника по продажам, звонкам и встречам.</w:t>
+        <w:t>Убедиться, что OAuth-пользователь имеет доступ на чтение каждого кабинета Директа и соответствующего счётчика Метрики. Логин Директа указывается именно для того рекламного клиента, данные которого должны попасть в юрлицо.</w:t>
       </w:r>
     </w:p>
     <w:p>
@@ -6431,7 +6464,7 @@
         <w:rPr>
           <w:rFonts w:ascii="Calibri" w:hAnsi="Calibri" w:eastAsia="Calibri"/>
         </w:rPr>
-        <w:t>Реализовать ожидаемые оплаты, две средние суммы, цикл сделки, менеджерские и отдельские KPI.</w:t>
+        <w:t>Нажать «Проверить подключение» для каждой карточки. Исправить права или идентификаторы, если проверка не подтверждает одновременно Директ и Метрику.</w:t>
       </w:r>
     </w:p>
     <w:p>
@@ -6442,7 +6475,48 @@
         <w:rPr>
           <w:rFonts w:ascii="Calibri" w:hAnsi="Calibri" w:eastAsia="Calibri"/>
         </w:rPr>
-        <w:t>Добавить RBAC и скрытие финансов для роли менеджера; построчные AI-комментарии.</w:t>
+        <w:t>Запустить полный пересчёт. Проверить появление расходов в «Расходах по статьям», визитов и кампаний, а после загрузки поступлений 1С — значений в «ROMI по каналам».</w:t>
+      </w:r>
+    </w:p>
+    <w:p>
+      <w:pPr>
+        <w:pStyle w:val="Heading2"/>
+      </w:pPr>
+      <w:r>
+        <w:t>Остальные бизнес-настройки</w:t>
+      </w:r>
+    </w:p>
+    <w:p>
+      <w:pPr>
+        <w:pStyle w:val="ListNumber"/>
+      </w:pPr>
+      <w:r>
+        <w:rPr>
+          <w:rFonts w:ascii="Calibri" w:hAnsi="Calibri" w:eastAsia="Calibri"/>
+        </w:rPr>
+        <w:t>Оставить в панели ровно 11 согласованных воронок и привязать каждую к юрлицу и профилю SLA. Сейчас включено 15.</w:t>
+      </w:r>
+    </w:p>
+    <w:p>
+      <w:pPr>
+        <w:pStyle w:val="ListNumber"/>
+      </w:pPr>
+      <w:r>
+        <w:rPr>
+          <w:rFonts w:ascii="Calibri" w:hAnsi="Calibri" w:eastAsia="Calibri"/>
+        </w:rPr>
+        <w:t>Подтвердить стадии ожидаемой оплаты и финальную трактовку стадии «Заключение Контракта».</w:t>
+      </w:r>
+    </w:p>
+    <w:p>
+      <w:pPr>
+        <w:pStyle w:val="ListNumber"/>
+      </w:pPr>
+      <w:r>
+        <w:rPr>
+          <w:rFonts w:ascii="Calibri" w:hAnsi="Calibri" w:eastAsia="Calibri"/>
+        </w:rPr>
+        <w:t>Проверить боевую выгрузку 1С и разобрать журнал исключённых и несопоставленных поступлений.</w:t>
       </w:r>
     </w:p>
     <w:p>
@@ -6569,7 +6643,7 @@
                 <w:color w:val="315E86"/>
                 <w:sz w:val="18"/>
               </w:rPr>
-              <w:t>Дашборд</w:t>
+              <w:t>Дашборд и ROMI</w:t>
             </w:r>
           </w:p>
         </w:tc>
@@ -6602,7 +6676,7 @@
                 <w:color w:val="1F2937"/>
                 <w:sz w:val="18"/>
               </w:rPr>
-              <w:t>frontend/src/pages/DashboardPage.tsx</w:t>
+              <w:t>DashboardPage.tsx; GET /api/dashboard/*; GET /api/romi/by-channel</w:t>
             </w:r>
           </w:p>
         </w:tc>
@@ -6638,7 +6712,7 @@
                 <w:color w:val="315E86"/>
                 <w:sz w:val="18"/>
               </w:rPr>
-              <w:t>Журнал расходов</w:t>
+              <w:t>Расходы</w:t>
             </w:r>
           </w:p>
         </w:tc>
@@ -6671,7 +6745,7 @@
                 <w:color w:val="1F2937"/>
                 <w:sz w:val="18"/>
               </w:rPr>
-              <w:t>frontend/src/pages/BusinessSettingsPage.tsx → вкладка «Расходы»</w:t>
+              <w:t>BusinessSettingsPage.tsx; /api/admin/expenses; /api/dashboard/expenses-by-article</w:t>
             </w:r>
           </w:p>
         </w:tc>
@@ -6707,7 +6781,7 @@
                 <w:color w:val="315E86"/>
                 <w:sz w:val="18"/>
               </w:rPr>
-              <w:t>API расходов</w:t>
+              <w:t>План-факт и отделы</w:t>
             </w:r>
           </w:p>
         </w:tc>
@@ -6740,7 +6814,7 @@
                 <w:color w:val="1F2937"/>
                 <w:sz w:val="18"/>
               </w:rPr>
-              <w:t>GET/POST /api/admin/expenses; PUT/DELETE /api/admin/expenses/{id}</w:t>
+              <w:t>GET /api/dashboard/plan-fact; /departments; backend/app/services/plan_fact.py</w:t>
             </w:r>
           </w:p>
         </w:tc>
@@ -6776,7 +6850,7 @@
                 <w:color w:val="315E86"/>
                 <w:sz w:val="18"/>
               </w:rPr>
-              <w:t>Агрегация статей</w:t>
+              <w:t>Роли и пользователи</w:t>
             </w:r>
           </w:p>
         </w:tc>
@@ -6809,7 +6883,7 @@
                 <w:color w:val="1F2937"/>
                 <w:sz w:val="18"/>
               </w:rPr>
-              <w:t>GET /api/dashboard/expenses-by-article</w:t>
+              <w:t>GET/POST/PUT/DELETE /api/admin/users; AppUser; RequireRole</w:t>
             </w:r>
           </w:p>
         </w:tc>
@@ -6845,7 +6919,7 @@
                 <w:color w:val="315E86"/>
                 <w:sz w:val="18"/>
               </w:rPr>
-              <w:t>ROMI</w:t>
+              <w:t>CRM и комментарии</w:t>
             </w:r>
           </w:p>
         </w:tc>
@@ -6878,7 +6952,7 @@
                 <w:color w:val="1F2937"/>
                 <w:sz w:val="18"/>
               </w:rPr>
-              <w:t>GET /api/romi/by-channel; backend/app/services/analytics.py; channels.py; metrics.py</w:t>
+              <w:t>stage_history; crm_activities; deal_comments.py; Alembic 0010–0011 и 0013</w:t>
             </w:r>
           </w:p>
         </w:tc>
@@ -6914,7 +6988,7 @@
                 <w:color w:val="315E86"/>
                 <w:sz w:val="18"/>
               </w:rPr>
-              <w:t>Модель БД</w:t>
+              <w:t>Настройки и интеграции</w:t>
             </w:r>
           </w:p>
         </w:tc>
@@ -6947,145 +7021,7 @@
                 <w:color w:val="1F2937"/>
                 <w:sz w:val="18"/>
               </w:rPr>
-              <w:t>manual_expenses; Alembic 0009_manual_expenses.py</w:t>
-            </w:r>
-          </w:p>
-        </w:tc>
-      </w:tr>
-      <w:tr>
-        <w:tc>
-          <w:tcPr>
-            <w:tcW w:type="dxa" w:w="2600"/>
-            <w:tcMar>
-              <w:top w:w="80" w:type="dxa"/>
-              <w:start w:w="120" w:type="dxa"/>
-              <w:bottom w:w="80" w:type="dxa"/>
-              <w:end w:w="120" w:type="dxa"/>
-            </w:tcMar>
-            <w:tcBorders>
-              <w:top w:val="single" w:sz="4" w:color="D0D5DD"/>
-              <w:left w:val="single" w:sz="4" w:color="D0D5DD"/>
-              <w:bottom w:val="single" w:sz="4" w:color="D0D5DD"/>
-              <w:right w:val="single" w:sz="4" w:color="D0D5DD"/>
-              <w:insideH w:val="single" w:sz="4" w:color="D0D5DD"/>
-              <w:insideV w:val="single" w:sz="4" w:color="D0D5DD"/>
-            </w:tcBorders>
-            <w:shd w:fill="F2F4F7"/>
-          </w:tcPr>
-          <w:p>
-            <w:pPr>
-              <w:spacing w:after="0"/>
-            </w:pPr>
-            <w:r>
-              <w:rPr>
-                <w:rFonts w:ascii="Calibri" w:hAnsi="Calibri" w:eastAsia="Calibri"/>
-                <w:b/>
-                <w:color w:val="315E86"/>
-                <w:sz w:val="18"/>
-              </w:rPr>
-              <w:t>Настройки бизнеса</w:t>
-            </w:r>
-          </w:p>
-        </w:tc>
-        <w:tc>
-          <w:tcPr>
-            <w:tcW w:type="dxa" w:w="6760"/>
-            <w:tcMar>
-              <w:top w:w="80" w:type="dxa"/>
-              <w:start w:w="120" w:type="dxa"/>
-              <w:bottom w:w="80" w:type="dxa"/>
-              <w:end w:w="120" w:type="dxa"/>
-            </w:tcMar>
-            <w:tcBorders>
-              <w:top w:val="single" w:sz="4" w:color="D0D5DD"/>
-              <w:left w:val="single" w:sz="4" w:color="D0D5DD"/>
-              <w:bottom w:val="single" w:sz="4" w:color="D0D5DD"/>
-              <w:right w:val="single" w:sz="4" w:color="D0D5DD"/>
-              <w:insideH w:val="single" w:sz="4" w:color="D0D5DD"/>
-              <w:insideV w:val="single" w:sz="4" w:color="D0D5DD"/>
-            </w:tcBorders>
-          </w:tcPr>
-          <w:p>
-            <w:pPr>
-              <w:spacing w:after="0"/>
-            </w:pPr>
-            <w:r>
-              <w:rPr>
-                <w:rFonts w:ascii="Calibri" w:hAnsi="Calibri" w:eastAsia="Calibri"/>
-                <w:b w:val="0"/>
-                <w:color w:val="1F2937"/>
-                <w:sz w:val="18"/>
-              </w:rPr>
-              <w:t>GET/PUT /api/admin/business-settings</w:t>
-            </w:r>
-          </w:p>
-        </w:tc>
-      </w:tr>
-      <w:tr>
-        <w:tc>
-          <w:tcPr>
-            <w:tcW w:type="dxa" w:w="2600"/>
-            <w:tcMar>
-              <w:top w:w="80" w:type="dxa"/>
-              <w:start w:w="120" w:type="dxa"/>
-              <w:bottom w:w="80" w:type="dxa"/>
-              <w:end w:w="120" w:type="dxa"/>
-            </w:tcMar>
-            <w:tcBorders>
-              <w:top w:val="single" w:sz="4" w:color="D0D5DD"/>
-              <w:left w:val="single" w:sz="4" w:color="D0D5DD"/>
-              <w:bottom w:val="single" w:sz="4" w:color="D0D5DD"/>
-              <w:right w:val="single" w:sz="4" w:color="D0D5DD"/>
-              <w:insideH w:val="single" w:sz="4" w:color="D0D5DD"/>
-              <w:insideV w:val="single" w:sz="4" w:color="D0D5DD"/>
-            </w:tcBorders>
-            <w:shd w:fill="F2F4F7"/>
-          </w:tcPr>
-          <w:p>
-            <w:pPr>
-              <w:spacing w:after="0"/>
-            </w:pPr>
-            <w:r>
-              <w:rPr>
-                <w:rFonts w:ascii="Calibri" w:hAnsi="Calibri" w:eastAsia="Calibri"/>
-                <w:b/>
-                <w:color w:val="315E86"/>
-                <w:sz w:val="18"/>
-              </w:rPr>
-              <w:t>Интеграции</w:t>
-            </w:r>
-          </w:p>
-        </w:tc>
-        <w:tc>
-          <w:tcPr>
-            <w:tcW w:type="dxa" w:w="6760"/>
-            <w:tcMar>
-              <w:top w:w="80" w:type="dxa"/>
-              <w:start w:w="120" w:type="dxa"/>
-              <w:bottom w:w="80" w:type="dxa"/>
-              <w:end w:w="120" w:type="dxa"/>
-            </w:tcMar>
-            <w:tcBorders>
-              <w:top w:val="single" w:sz="4" w:color="D0D5DD"/>
-              <w:left w:val="single" w:sz="4" w:color="D0D5DD"/>
-              <w:bottom w:val="single" w:sz="4" w:color="D0D5DD"/>
-              <w:right w:val="single" w:sz="4" w:color="D0D5DD"/>
-              <w:insideH w:val="single" w:sz="4" w:color="D0D5DD"/>
-              <w:insideV w:val="single" w:sz="4" w:color="D0D5DD"/>
-            </w:tcBorders>
-          </w:tcPr>
-          <w:p>
-            <w:pPr>
-              <w:spacing w:after="0"/>
-            </w:pPr>
-            <w:r>
-              <w:rPr>
-                <w:rFonts w:ascii="Calibri" w:hAnsi="Calibri" w:eastAsia="Calibri"/>
-                <w:b w:val="0"/>
-                <w:color w:val="1F2937"/>
-                <w:sz w:val="18"/>
-              </w:rPr>
-              <w:t>GET/PUT /api/integrations/settings; /test/*; /bitrix/funnels</w:t>
+              <w:t>/api/admin/business-settings; /api/integrations/settings; /bitrix/funnels</w:t>
             </w:r>
           </w:p>
         </w:tc>
@@ -7219,7 +7155,7 @@
                 <w:color w:val="1F2937"/>
                 <w:sz w:val="19"/>
               </w:rPr>
-              <w:t>Отчёт отражает состояние кода и production на 03.09.2026. Пункты со статусом «Требует настройки» не считаются принятыми до появления боевых фактов; «Частично» и «Не реализовано» требуют доработки до финальной приёмки.</w:t>
+              <w:t>Отчёт отражает состояние GitHub main и production на 05.09.2026. Пункты со статусом «Требует настройки» не считаются принятыми до заполнения доступов, структуры и планов и до появления боевых фактов. Секретные значения в документ не включены.</w:t>
             </w:r>
           </w:p>
         </w:tc>
@@ -7250,7 +7186,7 @@
         <w:color w:val="667085"/>
         <w:sz w:val="17"/>
       </w:rPr>
-      <w:t xml:space="preserve">Конфиденциально  ·  03.09.2026  ·  </w:t>
+      <w:t xml:space="preserve">Конфиденциально  ·  05.09.2026  ·  </w:t>
     </w:r>
     <w:r>
       <w:rPr>

</xml_diff>